<commit_message>
3.1.A.6.2: amount_to_words - 00 kopek pri nulevyh kopejkah + testy + peregeneraciya golden
</commit_message>
<xml_diff>
--- a/tests/data/golden/gap.docx
+++ b/tests/data/golden/gap.docx
@@ -4011,7 +4011,7 @@
           <w:sz w:val="22"/>
           <w:szCs w:val="24"/>
         </w:rPr>
-        <w:t xml:space="preserve">руб. (Сто восемьдесят тысяч триста рублей ноль копеек)</w:t>
+        <w:t xml:space="preserve">руб. (Сто восемьдесят тысяч триста рублей 00 копеек)</w:t>
       </w:r>
       <w:r>
         <w:rPr>
@@ -4064,7 +4064,7 @@
           <w:sz w:val="22"/>
           <w:szCs w:val="24"/>
         </w:rPr>
-        <w:t xml:space="preserve">НДС по ставке, действующей на дату оказания услуг (в настоящее время 22%) 39666.00 руб. (Тридцать девять тысяч шестьсот шестьдесят шесть рублей ноль копеек).</w:t>
+        <w:t xml:space="preserve">НДС по ставке, действующей на дату оказания услуг (в настоящее время 22%) 39666.00 руб. (Тридцать девять тысяч шестьсот шестьдесят шесть рублей 00 копеек).</w:t>
       </w:r>
     </w:p>
     <w:p>
@@ -4124,7 +4124,7 @@
           <w:sz w:val="22"/>
           <w:szCs w:val="24"/>
         </w:rPr>
-        <w:t xml:space="preserve">(Двести девятнадцать тысяч девятьсот шестьдесят шесть рублей ноль копеек)</w:t>
+        <w:t xml:space="preserve">(Двести девятнадцать тысяч девятьсот шестьдесят шесть рублей 00 копеек)</w:t>
       </w:r>
       <w:r>
         <w:rPr>

</xml_diff>